<commit_message>
Update project presentation and summary deliverables
Refresh the PowerPoint presentation and project summary, along with their corresponding PDF exports.
</commit_message>
<xml_diff>
--- a/Project-Summary_OLLM_Project_1.docx
+++ b/Project-Summary_OLLM_Project_1.docx
@@ -147,7 +147,7 @@
           <w:szCs w:val="21"/>
           <w:lang w:val="en-US"/>
         </w:rPr>
-        <w:t xml:space="preserve"> 5 invented orders, each at a different stage (shipped, delivered, delayed, processing, returned), using example e-mail addresses so no real personal data is involved. The bot looks them up to answer “Where is my order?”, which the general help documents cannot answer.</w:t>
+        <w:t xml:space="preserve"> 5 invented orders at different stages (shipped, delivered, delayed, processing, returned) answer “Where is my order?”, which the help documents cannot. The table also holds example e-mail addresses, but the bot does not use them: the order number alone is enough, and the e-mail column is never read or shown.</w:t>
       </w:r>
     </w:p>
     <w:p xmlns:wp14="http://schemas.microsoft.com/office/word/2010/wordml" wp14:textId="77777777">
@@ -336,7 +336,7 @@
           <w:noProof w:val="0"/>
           <w:lang w:val="en-US"/>
         </w:rPr>
-        <w:t xml:space="preserve"> the answers are written by gpt-oss-120b, run on Groq’s free service, with low randomness (temperature 0.2) and short internal thinking. When a customer gives an order number, the AI can ask the program to look it up; the program checks that the tool exists and runs one fixed, parameterised query on the read-only database, so the AI can never change data, write its own SQL or see stored e-mail addresses. The order number alone is enough; the bot never asks for an e-mail.</w:t>
+        <w:t xml:space="preserve"> answers come from gpt-oss-120b on Groq’s free service, with low randomness (temperature 0.2) and short internal thinking. When a customer gives an order number, the AI can request a lookup; the program checks that the tool exists and runs one fixed, parameterised query by order number only on the read-only database, so the AI can never change data or write its own SQL.</w:t>
       </w:r>
     </w:p>
     <w:p>
@@ -1018,7 +1018,7 @@
           <w:noProof w:val="0"/>
           <w:lang w:val="en-US"/>
         </w:rPr>
-        <w:t xml:space="preserve"> anyone with an order number can see that order’s status; in T22, a customer with the wrong e-mail still received it. Card numbers are hidden, but expiry dates and CVV codes are not. Using real customer data would require a data-processing agreement with the API provider.</w:t>
+        <w:t xml:space="preserve"> the lookup uses only the order number, so anyone who knows one can see that order’s status (in T22, a customer who gave a different e-mail still received it). Using real customer data would require a data-processing agreement with the API provider.</w:t>
       </w:r>
     </w:p>
     <w:p>
@@ -1044,7 +1044,7 @@
           <w:noProof w:val="0"/>
           <w:lang w:val="en-US"/>
         </w:rPr>
-        <w:t xml:space="preserve"> our defences (phrase filter, delimiter tags, output checks, read-only tool) follow OWASP’s recommended mitigations, but the filter catches only known wordings and blocked messages stay in the chat history. The main protection is the narrow, read-only tool: even a successful attack can only read order statuses by number.</w:t>
+        <w:t xml:space="preserve"> our defences (phrase filter, delimiter tags, output checks, read-only tool) follow OWASP’s mitigations, but the filter catches only known wordings and blocked messages stay in the chat history. The main protection is the narrow, read-only tool: an attack can only read order statuses.</w:t>
       </w:r>
     </w:p>
     <w:p xmlns:wp14="http://schemas.microsoft.com/office/word/2010/wordml" wp14:textId="77777777">
@@ -1059,10 +1059,10 @@
         <w:rPr>
           <w:b/>
         </w:rPr>
-        <w:t>Transparency and hand-off:</w:t>
-      </w:r>
-      <w:r>
-        <w:t xml:space="preserve"> under the EU AI Act, customers must be told they are talking to an AI; the web chat does not show such a notice yet. The prototype has no hand-off to a human agent.</w:t>
+        <w:t>Guardrail code gaps:</w:t>
+      </w:r>
+      <w:r>
+        <w:t xml:space="preserve"> the masking rules are simple regular expressions, so the phone pattern also hides dates such as 2026-10-12, while CVV codes and expiry dates stay visible; our tag names are stripped in a single pass, so a nested tag can still rebuild &lt;/customer_message&gt;.</w:t>
       </w:r>
     </w:p>
     <w:p>
@@ -1079,14 +1079,14 @@
           <w:b w:val="1"/>
           <w:bCs w:val="1"/>
         </w:rPr>
-        <w:t>Operations:</w:t>
-      </w:r>
-      <w:r>
-        <w:rPr>
-          <w:noProof w:val="0"/>
-          <w:lang w:val="en-US"/>
-        </w:rPr>
-        <w:t xml:space="preserve"> answers can differ slightly between runs; free-tier rate limits and queueing slow answers down (8.1 s on average), and failed calls get only the Groq client’s default 2 retries.</w:t>
+        <w:t>Retrieval, tool and memory code:</w:t>
+      </w:r>
+      <w:r>
+        <w:rPr>
+          <w:noProof w:val="0"/>
+          <w:lang w:val="en-US"/>
+        </w:rPr>
+        <w:t xml:space="preserve"> no similarity threshold, so the 3 closest documents are sent even for off-topic questions; order numbers are not format-checked; the tool loop has no call limit; only the last 5 question–answer pairs are sent; a Groq call that fails after 2 default retries gives an empty reply.</w:t>
       </w:r>
     </w:p>
     <w:p>

</xml_diff>